<commit_message>
fix: 주간리포트 docx 변환 시 개발현황 섹션 누락 수정 + collector.py CSV_COLUMNS korean_summary 추가
Co-Authored-By: Claude Sonnet 5 <noreply@anthropic.com>
Claude-Session: https://claude.ai/code/session_01W9eU19HVD9E5YRcGzAdRbW
</commit_message>
<xml_diff>
--- a/reports/20260824_weekly.docx
+++ b/reports/20260824_weekly.docx
@@ -99,6 +99,198 @@
         </w:rPr>
         <w:t>분석기간:** 2026년 8월 17일 ~ 8월 24일 | **총 374건 분석</w:t>
       </w:r>
+    </w:p>
+    <w:p>
+      <w:pPr>
+        <w:pBdr>
+          <w:bottom w:val="single" w:sz="4" w:space="1" w:color="1B3A5C"/>
+        </w:pBdr>
+      </w:pPr>
+    </w:p>
+    <w:p/>
+    <w:p>
+      <w:pPr>
+        <w:pBdr>
+          <w:bottom w:val="single" w:sz="4" w:space="1" w:color="2E75B6"/>
+        </w:pBdr>
+      </w:pPr>
+      <w:r>
+        <w:rPr>
+          <w:rFonts w:ascii="Noto Sans KR" w:hAnsi="Noto Sans KR" w:eastAsia="Noto Sans KR"/>
+          <w:b/>
+          <w:i w:val="0"/>
+          <w:color w:val="2E75B6"/>
+          <w:sz w:val="26"/>
+        </w:rPr>
+        <w:t>1. 개발 현황</w:t>
+      </w:r>
+    </w:p>
+    <w:p>
+      <w:pPr>
+        <w:pStyle w:val="ListBullet"/>
+        <w:ind w:left="360"/>
+      </w:pPr>
+      <w:r>
+        <w:rPr>
+          <w:rFonts w:ascii="Noto Sans KR" w:hAnsi="Noto Sans KR" w:eastAsia="Noto Sans KR"/>
+          <w:b w:val="0"/>
+          <w:i w:val="0"/>
+          <w:sz w:val="20"/>
+        </w:rPr>
+      </w:r>
+      <w:r>
+        <w:rPr>
+          <w:rFonts w:ascii="Noto Sans KR" w:hAnsi="Noto Sans KR" w:eastAsia="Noto Sans KR"/>
+          <w:b/>
+          <w:i w:val="0"/>
+          <w:sz w:val="20"/>
+        </w:rPr>
+        <w:t>Student Housing 대규모 공급 집중</w:t>
+      </w:r>
+      <w:r>
+        <w:rPr>
+          <w:rFonts w:ascii="Noto Sans KR" w:hAnsi="Noto Sans KR" w:eastAsia="Noto Sans KR"/>
+          <w:b w:val="0"/>
+          <w:i w:val="0"/>
+          <w:sz w:val="20"/>
+        </w:rPr>
+        <w:t>: University of Michigan Wolverine Village(2,300beds, $649M), University of Utah(1,447beds, $155M), Core Spaces의 Texas A&amp;M 프로젝트(2,201beds) 등 대형 프로젝트가 동시 착공/준공되며 공급 급증. Florida Tech는 등록생 27% 증가에 따라 $96M 프로젝트 추진 중.</w:t>
+      </w:r>
+    </w:p>
+    <w:p>
+      <w:pPr>
+        <w:pStyle w:val="ListBullet"/>
+        <w:ind w:left="360"/>
+      </w:pPr>
+      <w:r>
+        <w:rPr>
+          <w:rFonts w:ascii="Noto Sans KR" w:hAnsi="Noto Sans KR" w:eastAsia="Noto Sans KR"/>
+          <w:b w:val="0"/>
+          <w:i w:val="0"/>
+          <w:sz w:val="20"/>
+        </w:rPr>
+      </w:r>
+      <w:r>
+        <w:rPr>
+          <w:rFonts w:ascii="Noto Sans KR" w:hAnsi="Noto Sans KR" w:eastAsia="Noto Sans KR"/>
+          <w:b/>
+          <w:i w:val="0"/>
+          <w:sz w:val="20"/>
+        </w:rPr>
+        <w:t>BTR 시장 본격화</w:t>
+      </w:r>
+      <w:r>
+        <w:rPr>
+          <w:rFonts w:ascii="Noto Sans KR" w:hAnsi="Noto Sans KR" w:eastAsia="Noto Sans KR"/>
+          <w:b w:val="0"/>
+          <w:i w:val="0"/>
+          <w:sz w:val="20"/>
+        </w:rPr>
+        <w:t>: The Charlie ABQ(Albuquerque, 344homes), Stark Enterprises의 Iowa 진출(Blue Creek Village, 164homes), Princeton 지역 Casa Princeton Phase III(162units) 등 BTR 개발이 Sun Belt 외 중소도시로 확산. 기존 아파트와 차별화된 단독주택형 렌탈 수요 확대.</w:t>
+      </w:r>
+    </w:p>
+    <w:p>
+      <w:pPr>
+        <w:pStyle w:val="ListBullet"/>
+        <w:ind w:left="360"/>
+      </w:pPr>
+      <w:r>
+        <w:rPr>
+          <w:rFonts w:ascii="Noto Sans KR" w:hAnsi="Noto Sans KR" w:eastAsia="Noto Sans KR"/>
+          <w:b w:val="0"/>
+          <w:i w:val="0"/>
+          <w:sz w:val="20"/>
+        </w:rPr>
+      </w:r>
+      <w:r>
+        <w:rPr>
+          <w:rFonts w:ascii="Noto Sans KR" w:hAnsi="Noto Sans KR" w:eastAsia="Noto Sans KR"/>
+          <w:b/>
+          <w:i w:val="0"/>
+          <w:sz w:val="20"/>
+        </w:rPr>
+        <w:t>Multifamily 신규착공 감소</w:t>
+      </w:r>
+      <w:r>
+        <w:rPr>
+          <w:rFonts w:ascii="Noto Sans KR" w:hAnsi="Noto Sans KR" w:eastAsia="Noto Sans KR"/>
+          <w:b w:val="0"/>
+          <w:i w:val="0"/>
+          <w:sz w:val="20"/>
+        </w:rPr>
+        <w:t>: HUD/Census 데이터에 따르면 7월 다가구 착공이 YoY 7.1% 하락하며 공급 둔화 신호. 반면 LA County는 상반기 8,800호 인허가로 회복세. JPI의 Gardena 257units, Thompson Thrift의 Birmingham 외곽 300units 등 선별적 개발 지속.</w:t>
+      </w:r>
+    </w:p>
+    <w:p>
+      <w:pPr>
+        <w:pStyle w:val="ListBullet"/>
+        <w:ind w:left="360"/>
+      </w:pPr>
+      <w:r>
+        <w:rPr>
+          <w:rFonts w:ascii="Noto Sans KR" w:hAnsi="Noto Sans KR" w:eastAsia="Noto Sans KR"/>
+          <w:b w:val="0"/>
+          <w:i w:val="0"/>
+          <w:sz w:val="20"/>
+        </w:rPr>
+      </w:r>
+      <w:r>
+        <w:rPr>
+          <w:rFonts w:ascii="Noto Sans KR" w:hAnsi="Noto Sans KR" w:eastAsia="Noto Sans KR"/>
+          <w:b/>
+          <w:i w:val="0"/>
+          <w:sz w:val="20"/>
+        </w:rPr>
+        <w:t>Affordable Housing 정책자금 유입</w:t>
+      </w:r>
+      <w:r>
+        <w:rPr>
+          <w:rFonts w:ascii="Noto Sans KR" w:hAnsi="Noto Sans KR" w:eastAsia="Noto Sans KR"/>
+          <w:b w:val="0"/>
+          <w:i w:val="0"/>
+          <w:sz w:val="20"/>
+        </w:rPr>
+        <w:t>: California 주정부가 Boyle Heights 프로젝트에 $6.5M 지원, Tustin $175M 개발 착공 등 공공재원 기반 프로젝트 활성화. 주거 부족 해소 위한 정부 인센티브가 개발 동력으로 작용.</w:t>
+      </w:r>
+    </w:p>
+    <w:p>
+      <w:pPr>
+        <w:pStyle w:val="ListBullet"/>
+        <w:ind w:left="360"/>
+      </w:pPr>
+      <w:r>
+        <w:rPr>
+          <w:rFonts w:ascii="Noto Sans KR" w:hAnsi="Noto Sans KR" w:eastAsia="Noto Sans KR"/>
+          <w:b w:val="0"/>
+          <w:i w:val="0"/>
+          <w:sz w:val="20"/>
+        </w:rPr>
+      </w:r>
+      <w:r>
+        <w:rPr>
+          <w:rFonts w:ascii="Noto Sans KR" w:hAnsi="Noto Sans KR" w:eastAsia="Noto Sans KR"/>
+          <w:b/>
+          <w:i w:val="0"/>
+          <w:sz w:val="20"/>
+        </w:rPr>
+        <w:t>Mixed-Use 대형화</w:t>
+      </w:r>
+      <w:r>
+        <w:rPr>
+          <w:rFonts w:ascii="Noto Sans KR" w:hAnsi="Noto Sans KR" w:eastAsia="Noto Sans KR"/>
+          <w:b w:val="0"/>
+          <w:i w:val="0"/>
+          <w:sz w:val="20"/>
+        </w:rPr>
+        <w:t>: OCVibe(Anaheim, $5B 규모 100acre), Boca Raton Broken Sound Residences(494units) 등 스포츠/상업 시설 연계 복합개발이 트렌드. 주거+리테일+오피스 통합 마스터플랜 확대.</w:t>
+      </w:r>
+    </w:p>
+    <w:p>
+      <w:pPr>
+        <w:pBdr>
+          <w:bottom w:val="single" w:sz="4" w:space="1" w:color="1B3A5C"/>
+        </w:pBdr>
+      </w:pPr>
     </w:p>
     <w:p/>
     <w:p>
@@ -245,6 +437,13 @@
         </w:rPr>
         <w:t>: Prosper(TX) 등 신흥 성장지역에서 대규모 mixed-use 프로젝트 인허가 가속화. 지자체들이 경제개발 목적으로 개발친화적 태도 전환 중.</w:t>
       </w:r>
+    </w:p>
+    <w:p>
+      <w:pPr>
+        <w:pBdr>
+          <w:bottom w:val="single" w:sz="4" w:space="1" w:color="1B3A5C"/>
+        </w:pBdr>
+      </w:pPr>
     </w:p>
     <w:p/>
     <w:p>
@@ -423,6 +622,13 @@
         </w:rPr>
         <w:t>: PGIM의 Delray Beach 시니어하우징 매각($140M+)이 남부 플로리다 최대 거래 기록. 고령화 수혜 섹터로 기관투자자 관심 집중.</w:t>
       </w:r>
+    </w:p>
+    <w:p>
+      <w:pPr>
+        <w:pBdr>
+          <w:bottom w:val="single" w:sz="4" w:space="1" w:color="1B3A5C"/>
+        </w:pBdr>
+      </w:pPr>
     </w:p>
     <w:p/>
     <w:p>

</xml_diff>